<commit_message>
gerekli testler arttrıldı metinlerdeki skor hesaplaması düzeltildi ve sonuc grafikleri eklendi
</commit_message>
<xml_diff>
--- a/paper/metrics_method_tr.docx
+++ b/paper/metrics_method_tr.docx
@@ -1417,6 +1417,29 @@
     </w:p>
     <w:bookmarkEnd w:id="14"/>
     <w:bookmarkEnd w:id="15"/>
+    <w:p>
+      <w:pPr>
+        <w:pStyle w:val="Heading2"/>
+      </w:pPr>
+      <w:r>
+        <w:t>COMET</w:t>
+      </w:r>
+    </w:p>
+    <w:p>
+      <w:r>
+        <w:t>COMET, egitilmis bir kalite modeli kullanir. Girdi olarak kaynak (src), sistem cevirisi (mt) ve referans (ref) alir ve tek bir kalite skoru uretir.</w:t>
+      </w:r>
+    </w:p>
+    <w:p>
+      <w:r>
+        <w:t>Model, semantik uyumu da dikkate alarak insan benzeri kalite tahmini yapmayi hedefler.</w:t>
+      </w:r>
+    </w:p>
+    <w:p>
+      <w:r>
+        <w:t>Yorum: Yuksek skor daha iyi kaliteyi gosterir.</w:t>
+      </w:r>
+    </w:p>
     <w:sectPr>
       <w:footnotePr>
         <w:numRestart w:val="eachSect"/>

</xml_diff>